<commit_message>
update cv and remove contacts
</commit_message>
<xml_diff>
--- a/documents/pedro_guidobono_cv.docx
+++ b/documents/pedro_guidobono_cv.docx
@@ -106,31 +106,6 @@
         <w:jc w:val="center"/>
         <w:rPr>
           <w:rFonts w:ascii="Arial" w:eastAsia="Arial" w:hAnsi="Arial" w:cs="Arial"/>
-        </w:rPr>
-      </w:pPr>
-      <w:r>
-        <w:rPr>
-          <w:rFonts w:ascii="Arial" w:eastAsia="Arial" w:hAnsi="Arial" w:cs="Arial"/>
-        </w:rPr>
-        <w:t xml:space="preserve">Portfolio: </w:t>
-      </w:r>
-      <w:hyperlink r:id="rId6" w:history="1">
-        <w:r>
-          <w:rPr>
-            <w:rStyle w:val="Hyperlink"/>
-            <w:rFonts w:ascii="Arial" w:eastAsia="Arial" w:hAnsi="Arial" w:cs="Arial"/>
-          </w:rPr>
-          <w:t>https://pedroandrehg.github.io</w:t>
-        </w:r>
-      </w:hyperlink>
-    </w:p>
-    <w:p>
-      <w:pPr>
-        <w:spacing w:after="60" w:line="276" w:lineRule="auto"/>
-        <w:ind w:right="-166"/>
-        <w:jc w:val="center"/>
-        <w:rPr>
-          <w:rFonts w:ascii="Arial" w:eastAsia="Arial" w:hAnsi="Arial" w:cs="Arial"/>
           <w:color w:val="0000FF"/>
           <w:u w:val="single"/>
         </w:rPr>
@@ -138,69 +113,23 @@
       <w:r>
         <w:rPr>
           <w:rFonts w:ascii="Arial" w:eastAsia="Arial" w:hAnsi="Arial" w:cs="Arial"/>
-          <w:b/>
-          <w:bCs/>
-        </w:rPr>
-        <w:t>Phone:</w:t>
-      </w:r>
-      <w:r>
-        <w:rPr>
-          <w:rFonts w:ascii="Arial" w:eastAsia="Arial" w:hAnsi="Arial" w:cs="Arial"/>
-          <w:b/>
-          <w:bCs/>
-          <w:color w:val="000000"/>
+        </w:rPr>
+        <w:t xml:space="preserve">Portfolio: </w:t>
+      </w:r>
+      <w:r>
+        <w:rPr>
+          <w:rFonts w:ascii="Arial" w:eastAsia="Arial" w:hAnsi="Arial" w:cs="Arial"/>
+        </w:rPr>
+        <w:t>https://pedroandrehg.github.io</w:t>
+      </w:r>
+      <w:r>
+        <w:rPr>
+          <w:rFonts w:ascii="Arial" w:eastAsia="Arial" w:hAnsi="Arial" w:cs="Arial"/>
+          <w:color w:val="0000FF"/>
+          <w:u w:val="single"/>
         </w:rPr>
         <w:t xml:space="preserve"> </w:t>
       </w:r>
-      <w:r>
-        <w:rPr>
-          <w:rFonts w:ascii="Arial" w:eastAsia="Arial" w:hAnsi="Arial" w:cs="Arial"/>
-          <w:color w:val="000000"/>
-        </w:rPr>
-        <w:t xml:space="preserve">+356 99329974 </w:t>
-      </w:r>
-      <w:r>
-        <w:rPr>
-          <w:rFonts w:ascii="Arial" w:eastAsia="Arial" w:hAnsi="Arial" w:cs="Arial"/>
-          <w:b/>
-          <w:bCs/>
-          <w:color w:val="000000"/>
-        </w:rPr>
-        <w:t>|</w:t>
-      </w:r>
-      <w:r>
-        <w:rPr>
-          <w:rFonts w:ascii="Arial" w:eastAsia="Arial" w:hAnsi="Arial" w:cs="Arial"/>
-          <w:color w:val="000000"/>
-        </w:rPr>
-        <w:t xml:space="preserve"> </w:t>
-      </w:r>
-      <w:r>
-        <w:rPr>
-          <w:rFonts w:ascii="Arial" w:eastAsia="Arial" w:hAnsi="Arial" w:cs="Arial"/>
-          <w:b/>
-          <w:bCs/>
-          <w:color w:val="000000"/>
-        </w:rPr>
-        <w:t>Email:</w:t>
-      </w:r>
-      <w:r>
-        <w:rPr>
-          <w:rFonts w:ascii="Arial" w:eastAsia="Arial" w:hAnsi="Arial" w:cs="Arial"/>
-          <w:color w:val="000000"/>
-        </w:rPr>
-        <w:t xml:space="preserve"> </w:t>
-      </w:r>
-      <w:hyperlink r:id="rId7">
-        <w:r>
-          <w:rPr>
-            <w:rFonts w:ascii="Arial" w:eastAsia="Arial" w:hAnsi="Arial" w:cs="Arial"/>
-            <w:color w:val="0000FF"/>
-            <w:u w:val="single"/>
-          </w:rPr>
-          <w:t>pedroandrehg@gmail.com</w:t>
-        </w:r>
-      </w:hyperlink>
     </w:p>
     <w:p>
       <w:pPr>
@@ -1373,6 +1302,17 @@
         </w:rPr>
         <w:t>Improved Grafana Python code for custom behaviour when in a local environment.</w:t>
       </w:r>
+    </w:p>
+    <w:p>
+      <w:pPr>
+        <w:spacing w:after="0" w:line="276" w:lineRule="auto"/>
+        <w:ind w:left="708"/>
+        <w:jc w:val="both"/>
+        <w:rPr>
+          <w:rFonts w:ascii="Arial" w:eastAsia="Arial" w:hAnsi="Arial" w:cs="Arial"/>
+          <w:highlight w:val="white"/>
+        </w:rPr>
+      </w:pPr>
     </w:p>
     <w:p>
       <w:pPr>

</xml_diff>